<commit_message>
fix: update completeness calculation and report format in templated report
</commit_message>
<xml_diff>
--- a/finalcif/template/template_without_text.docx
+++ b/finalcif/template/template_without_text.docx
@@ -1,10 +1,10 @@
 
 <file path=word/document.xml><?xml version="1.0" encoding="utf-8"?>
-<w:document xmlns:wpc="http://schemas.microsoft.com/office/word/2010/wordprocessingCanvas" xmlns:cx="http://schemas.microsoft.com/office/drawing/2014/chartex" xmlns:cx1="http://schemas.microsoft.com/office/drawing/2015/9/8/chartex" xmlns:cx2="http://schemas.microsoft.com/office/drawing/2015/10/21/chartex" xmlns:cx3="http://schemas.microsoft.com/office/drawing/2016/5/9/chartex" xmlns:cx4="http://schemas.microsoft.com/office/drawing/2016/5/10/chartex" xmlns:cx5="http://schemas.microsoft.com/office/drawing/2016/5/11/chartex" xmlns:cx6="http://schemas.microsoft.com/office/drawing/2016/5/12/chartex" xmlns:cx7="http://schemas.microsoft.com/office/drawing/2016/5/13/chartex" xmlns:cx8="http://schemas.microsoft.com/office/drawing/2016/5/14/chartex" xmlns:mc="http://schemas.openxmlformats.org/markup-compatibility/2006" xmlns:aink="http://schemas.microsoft.com/office/drawing/2016/ink" xmlns:am3d="http://schemas.microsoft.com/office/drawing/2017/model3d" xmlns:o="urn:schemas-microsoft-com:office:office" xmlns:oel="http://schemas.microsoft.com/office/2019/extlst" xmlns:r="http://schemas.openxmlformats.org/officeDocument/2006/relationships" xmlns:m="http://schemas.openxmlformats.org/officeDocument/2006/math" xmlns:v="urn:schemas-microsoft-com:vml" xmlns:wp14="http://schemas.microsoft.com/office/word/2010/wordprocessingDrawing" xmlns:wp="http://schemas.openxmlformats.org/drawingml/2006/wordprocessingDrawing" xmlns:w10="urn:schemas-microsoft-com:office:word" xmlns:w="http://schemas.openxmlformats.org/wordprocessingml/2006/main" xmlns:w14="http://schemas.microsoft.com/office/word/2010/wordml" xmlns:w15="http://schemas.microsoft.com/office/word/2012/wordml" xmlns:w16cex="http://schemas.microsoft.com/office/word/2018/wordml/cex" xmlns:w16cid="http://schemas.microsoft.com/office/word/2016/wordml/cid" xmlns:w16="http://schemas.microsoft.com/office/word/2018/wordml" xmlns:w16sdtdh="http://schemas.microsoft.com/office/word/2020/wordml/sdtdatahash" xmlns:w16se="http://schemas.microsoft.com/office/word/2015/wordml/symex" xmlns:wpg="http://schemas.microsoft.com/office/word/2010/wordprocessingGroup" xmlns:wpi="http://schemas.microsoft.com/office/word/2010/wordprocessingInk" xmlns:wne="http://schemas.microsoft.com/office/word/2006/wordml" xmlns:wps="http://schemas.microsoft.com/office/word/2010/wordprocessingShape" mc:Ignorable="w14 w15 w16se w16cid w16 w16cex w16sdtdh wp14">
+<w:document xmlns:wpc="http://schemas.microsoft.com/office/word/2010/wordprocessingCanvas" xmlns:cx="http://schemas.microsoft.com/office/drawing/2014/chartex" xmlns:cx1="http://schemas.microsoft.com/office/drawing/2015/9/8/chartex" xmlns:cx2="http://schemas.microsoft.com/office/drawing/2015/10/21/chartex" xmlns:cx3="http://schemas.microsoft.com/office/drawing/2016/5/9/chartex" xmlns:cx4="http://schemas.microsoft.com/office/drawing/2016/5/10/chartex" xmlns:cx5="http://schemas.microsoft.com/office/drawing/2016/5/11/chartex" xmlns:cx6="http://schemas.microsoft.com/office/drawing/2016/5/12/chartex" xmlns:cx7="http://schemas.microsoft.com/office/drawing/2016/5/13/chartex" xmlns:cx8="http://schemas.microsoft.com/office/drawing/2016/5/14/chartex" xmlns:mc="http://schemas.openxmlformats.org/markup-compatibility/2006" xmlns:aink="http://schemas.microsoft.com/office/drawing/2016/ink" xmlns:am3d="http://schemas.microsoft.com/office/drawing/2017/model3d" xmlns:o="urn:schemas-microsoft-com:office:office" xmlns:oel="http://schemas.microsoft.com/office/2019/extlst" xmlns:r="http://schemas.openxmlformats.org/officeDocument/2006/relationships" xmlns:m="http://schemas.openxmlformats.org/officeDocument/2006/math" xmlns:v="urn:schemas-microsoft-com:vml" xmlns:wp14="http://schemas.microsoft.com/office/word/2010/wordprocessingDrawing" xmlns:wp="http://schemas.openxmlformats.org/drawingml/2006/wordprocessingDrawing" xmlns:w10="urn:schemas-microsoft-com:office:word" xmlns:w="http://schemas.openxmlformats.org/wordprocessingml/2006/main" xmlns:w14="http://schemas.microsoft.com/office/word/2010/wordml" xmlns:w15="http://schemas.microsoft.com/office/word/2012/wordml" xmlns:w16cex="http://schemas.microsoft.com/office/word/2018/wordml/cex" xmlns:w16cid="http://schemas.microsoft.com/office/word/2016/wordml/cid" xmlns:w16="http://schemas.microsoft.com/office/word/2018/wordml" xmlns:w16du="http://schemas.microsoft.com/office/word/2023/wordml/word16du" xmlns:w16sdtdh="http://schemas.microsoft.com/office/word/2020/wordml/sdtdatahash" xmlns:w16sdtfl="http://schemas.microsoft.com/office/word/2024/wordml/sdtformatlock" xmlns:w16se="http://schemas.microsoft.com/office/word/2015/wordml/symex" xmlns:wpg="http://schemas.microsoft.com/office/word/2010/wordprocessingGroup" xmlns:wpi="http://schemas.microsoft.com/office/word/2010/wordprocessingInk" xmlns:wne="http://schemas.microsoft.com/office/word/2006/wordml" xmlns:wps="http://schemas.microsoft.com/office/word/2010/wordprocessingShape" mc:Ignorable="w14 w15 w16se w16cid w16 w16cex w16sdtdh w16sdtfl w16du wp14">
   <w:body>
     <w:p>
       <w:pPr>
-        <w:pStyle w:val="berschrift1"/>
+        <w:pStyle w:val="Heading1"/>
       </w:pPr>
       <w:r>
         <w:t>Structure</w:t>
@@ -50,7 +50,7 @@
     </w:p>
     <w:p>
       <w:pPr>
-        <w:pStyle w:val="berschrift2"/>
+        <w:pStyle w:val="Heading2"/>
       </w:pPr>
       <w:r>
         <w:t xml:space="preserve">Table </w:t>
@@ -76,7 +76,7 @@
     </w:p>
     <w:tbl>
       <w:tblPr>
-        <w:tblStyle w:val="TabellemithellemGitternetz"/>
+        <w:tblStyle w:val="TableGridLight"/>
         <w:tblW w:w="4534" w:type="dxa"/>
         <w:tblLook w:val="04A0" w:firstRow="1" w:lastRow="0" w:firstColumn="1" w:lastColumn="0" w:noHBand="0" w:noVBand="1"/>
       </w:tblPr>
@@ -1474,11 +1474,7 @@
             </w:r>
             <w:proofErr w:type="spellEnd"/>
             <w:r>
-              <w:t xml:space="preserve"> = </w:t>
-            </w:r>
-            <w:proofErr w:type="gramStart"/>
-            <w:r>
-              <w:t>{{</w:t>
+              <w:t xml:space="preserve"> = {{</w:t>
             </w:r>
             <w:r>
               <w:t xml:space="preserve"> </w:t>
@@ -1488,14 +1484,7 @@
               <w:rPr>
                 <w:sz w:val="14"/>
               </w:rPr>
-              <w:t>r</w:t>
-            </w:r>
-            <w:proofErr w:type="gramEnd"/>
-            <w:r>
-              <w:rPr>
-                <w:sz w:val="14"/>
-              </w:rPr>
-              <w:t>_int</w:t>
+              <w:t>r_int</w:t>
             </w:r>
             <w:proofErr w:type="spellEnd"/>
             <w:r>
@@ -1672,6 +1661,9 @@
             <w:r>
               <w:t>}}</w:t>
             </w:r>
+            <w:r>
+              <w:t xml:space="preserve"> %</w:t>
+            </w:r>
           </w:p>
         </w:tc>
       </w:tr>
@@ -1843,11 +1835,7 @@
               <w:pStyle w:val="BodyText1"/>
             </w:pPr>
             <w:r>
-              <w:t>(</w:t>
-            </w:r>
-            <w:proofErr w:type="gramStart"/>
-            <w:r>
-              <w:t>{{</w:t>
+              <w:t>({{</w:t>
             </w:r>
             <w:r>
               <w:rPr>
@@ -1865,7 +1853,6 @@
               <w:t>abstype</w:t>
             </w:r>
             <w:proofErr w:type="spellEnd"/>
-            <w:proofErr w:type="gramEnd"/>
             <w:r>
               <w:rPr>
                 <w:sz w:val="15"/>
@@ -2505,7 +2492,7 @@
     </w:tbl>
     <w:p>
       <w:pPr>
-        <w:pStyle w:val="berschrift2"/>
+        <w:pStyle w:val="Heading2"/>
       </w:pPr>
       <w:r>
         <w:br w:type="page"/>
@@ -2532,7 +2519,7 @@
     </w:p>
     <w:p>
       <w:pPr>
-        <w:pStyle w:val="berschrift2"/>
+        <w:pStyle w:val="Heading2"/>
       </w:pPr>
       <w:r>
         <w:t>Refinement details for {{ cif.block.name }}</w:t>
@@ -2542,17 +2529,12 @@
       <w:pPr>
         <w:pStyle w:val="BodyText1"/>
       </w:pPr>
-      <w:proofErr w:type="gramStart"/>
       <w:r>
         <w:t xml:space="preserve">{{ </w:t>
       </w:r>
       <w:proofErr w:type="spellStart"/>
       <w:r>
-        <w:t>refinement</w:t>
-      </w:r>
-      <w:proofErr w:type="gramEnd"/>
-      <w:r>
-        <w:t>_details</w:t>
+        <w:t>refinement_details</w:t>
       </w:r>
       <w:proofErr w:type="spellEnd"/>
       <w:r>
@@ -2561,7 +2543,7 @@
     </w:p>
     <w:p>
       <w:pPr>
-        <w:pStyle w:val="berschrift2"/>
+        <w:pStyle w:val="Heading2"/>
       </w:pPr>
       <w:r>
         <w:t>{%</w:t>
@@ -2575,7 +2557,7 @@
     </w:p>
     <w:p>
       <w:pPr>
-        <w:pStyle w:val="berschrift2"/>
+        <w:pStyle w:val="Heading2"/>
       </w:pPr>
       <w:r>
         <w:t>{%</w:t>
@@ -2598,7 +2580,7 @@
     </w:p>
     <w:p>
       <w:pPr>
-        <w:pStyle w:val="berschrift2"/>
+        <w:pStyle w:val="Heading2"/>
       </w:pPr>
       <w:r>
         <w:t xml:space="preserve">Table </w:t>
@@ -2671,7 +2653,7 @@
     </w:p>
     <w:tbl>
       <w:tblPr>
-        <w:tblStyle w:val="TabellemithellemGitternetz"/>
+        <w:tblStyle w:val="TableGridLight"/>
         <w:tblW w:w="0" w:type="auto"/>
         <w:tblLayout w:type="fixed"/>
         <w:tblLook w:val="04A0" w:firstRow="1" w:lastRow="0" w:firstColumn="1" w:lastColumn="0" w:noHBand="0" w:noVBand="1"/>
@@ -2878,7 +2860,6 @@
             <w:pPr>
               <w:pStyle w:val="BodyText1"/>
             </w:pPr>
-            <w:proofErr w:type="gramStart"/>
             <w:r>
               <w:t xml:space="preserve">{{ </w:t>
             </w:r>
@@ -2890,7 +2871,6 @@
               </w:rPr>
               <w:t>atom</w:t>
             </w:r>
-            <w:proofErr w:type="gramEnd"/>
             <w:r>
               <w:rPr>
                 <w:sz w:val="16"/>
@@ -2917,7 +2897,6 @@
             <w:pPr>
               <w:pStyle w:val="BodyText1"/>
             </w:pPr>
-            <w:proofErr w:type="gramStart"/>
             <w:r>
               <w:t xml:space="preserve">{{ </w:t>
             </w:r>
@@ -2928,7 +2907,6 @@
               </w:rPr>
               <w:t>atom</w:t>
             </w:r>
-            <w:proofErr w:type="gramEnd"/>
             <w:r>
               <w:t>.x</w:t>
             </w:r>
@@ -2946,7 +2924,6 @@
             <w:pPr>
               <w:pStyle w:val="BodyText1"/>
             </w:pPr>
-            <w:proofErr w:type="gramStart"/>
             <w:r>
               <w:t xml:space="preserve">{{ </w:t>
             </w:r>
@@ -2957,7 +2934,6 @@
               </w:rPr>
               <w:t>atom</w:t>
             </w:r>
-            <w:proofErr w:type="gramEnd"/>
             <w:r>
               <w:t>.y</w:t>
             </w:r>
@@ -2975,7 +2951,6 @@
             <w:pPr>
               <w:pStyle w:val="BodyText1"/>
             </w:pPr>
-            <w:proofErr w:type="gramStart"/>
             <w:r>
               <w:t xml:space="preserve">{{ </w:t>
             </w:r>
@@ -2986,7 +2961,6 @@
               </w:rPr>
               <w:t>atom</w:t>
             </w:r>
-            <w:proofErr w:type="gramEnd"/>
             <w:r>
               <w:t>.z</w:t>
             </w:r>
@@ -3004,7 +2978,6 @@
             <w:pPr>
               <w:pStyle w:val="BodyText1"/>
             </w:pPr>
-            <w:proofErr w:type="gramStart"/>
             <w:r>
               <w:t xml:space="preserve">{{ </w:t>
             </w:r>
@@ -3015,7 +2988,6 @@
               </w:rPr>
               <w:t>atom</w:t>
             </w:r>
-            <w:proofErr w:type="gramEnd"/>
             <w:r>
               <w:t>.u_eq</w:t>
             </w:r>
@@ -3215,7 +3187,7 @@
     </w:p>
     <w:p>
       <w:pPr>
-        <w:pStyle w:val="berschrift2"/>
+        <w:pStyle w:val="Heading2"/>
       </w:pPr>
       <w:r>
         <w:t xml:space="preserve">Table </w:t>
@@ -3375,7 +3347,7 @@
     </w:p>
     <w:tbl>
       <w:tblPr>
-        <w:tblStyle w:val="TabellemithellemGitternetz"/>
+        <w:tblStyle w:val="TableGridLight"/>
         <w:tblW w:w="9634" w:type="dxa"/>
         <w:tblLayout w:type="fixed"/>
         <w:tblLook w:val="04A0" w:firstRow="1" w:lastRow="0" w:firstColumn="1" w:lastColumn="0" w:noHBand="0" w:noVBand="1"/>
@@ -3989,7 +3961,7 @@
     </w:p>
     <w:p>
       <w:pPr>
-        <w:pStyle w:val="berschrift2"/>
+        <w:pStyle w:val="Heading2"/>
         <w:sectPr>
           <w:pgSz w:w="11900" w:h="16840"/>
           <w:pgMar w:top="1418" w:right="1021" w:bottom="1418" w:left="1276" w:header="709" w:footer="709" w:gutter="0"/>
@@ -4021,7 +3993,7 @@
     </w:p>
     <w:tbl>
       <w:tblPr>
-        <w:tblStyle w:val="Tabellenraster"/>
+        <w:tblStyle w:val="TableGrid"/>
         <w:tblW w:w="0" w:type="auto"/>
         <w:tblLook w:val="04A0" w:firstRow="1" w:lastRow="0" w:firstColumn="1" w:lastColumn="0" w:noHBand="0" w:noVBand="1"/>
       </w:tblPr>
@@ -4401,19 +4373,11 @@
         <w:t xml:space="preserve">if </w:t>
       </w:r>
       <w:proofErr w:type="spellStart"/>
-      <w:proofErr w:type="gramStart"/>
       <w:r>
         <w:rPr>
           <w:color w:val="ED7D31" w:themeColor="accent2"/>
         </w:rPr>
-        <w:t>options.without</w:t>
-      </w:r>
-      <w:proofErr w:type="gramEnd"/>
-      <w:r>
-        <w:rPr>
-          <w:color w:val="ED7D31" w:themeColor="accent2"/>
-        </w:rPr>
-        <w:t>_h</w:t>
+        <w:t>options.without_h</w:t>
       </w:r>
       <w:proofErr w:type="spellEnd"/>
       <w:r>
@@ -4445,13 +4409,8 @@
         </w:rPr>
         <w:t xml:space="preserve">endif </w:t>
       </w:r>
-      <w:proofErr w:type="gramStart"/>
-      <w:r>
-        <w:t>%}{</w:t>
-      </w:r>
-      <w:proofErr w:type="gramEnd"/>
-      <w:r>
-        <w:t>%</w:t>
+      <w:r>
+        <w:t>%}{%</w:t>
       </w:r>
       <w:r>
         <w:t xml:space="preserve"> </w:t>
@@ -4603,7 +4562,7 @@
     </w:p>
     <w:p>
       <w:pPr>
-        <w:pStyle w:val="berschrift2"/>
+        <w:pStyle w:val="Heading2"/>
       </w:pPr>
       <w:r>
         <w:t xml:space="preserve">Table </w:t>
@@ -4640,7 +4599,7 @@
     </w:p>
     <w:tbl>
       <w:tblPr>
-        <w:tblStyle w:val="Tabellenraster"/>
+        <w:tblStyle w:val="TableGrid"/>
         <w:tblW w:w="0" w:type="auto"/>
         <w:tblLook w:val="04A0" w:firstRow="1" w:lastRow="0" w:firstColumn="1" w:lastColumn="0" w:noHBand="0" w:noVBand="1"/>
       </w:tblPr>
@@ -4802,19 +4761,11 @@
         <w:t xml:space="preserve">if </w:t>
       </w:r>
       <w:proofErr w:type="spellStart"/>
-      <w:proofErr w:type="gramStart"/>
       <w:r>
         <w:rPr>
           <w:color w:val="ED7D31" w:themeColor="accent2"/>
         </w:rPr>
-        <w:t>options.without</w:t>
-      </w:r>
-      <w:proofErr w:type="gramEnd"/>
-      <w:r>
-        <w:rPr>
-          <w:color w:val="ED7D31" w:themeColor="accent2"/>
-        </w:rPr>
-        <w:t>_h</w:t>
+        <w:t>options.without_h</w:t>
       </w:r>
       <w:proofErr w:type="spellEnd"/>
       <w:r>
@@ -4846,13 +4797,8 @@
         </w:rPr>
         <w:t xml:space="preserve">endif </w:t>
       </w:r>
-      <w:proofErr w:type="gramStart"/>
-      <w:r>
-        <w:t>%}{</w:t>
-      </w:r>
-      <w:proofErr w:type="gramEnd"/>
-      <w:r>
-        <w:t>%</w:t>
+      <w:r>
+        <w:t>%}{%</w:t>
       </w:r>
       <w:r>
         <w:t xml:space="preserve"> </w:t>
@@ -4998,7 +4944,7 @@
     </w:p>
     <w:p>
       <w:pPr>
-        <w:pStyle w:val="berschrift2"/>
+        <w:pStyle w:val="Heading2"/>
       </w:pPr>
       <w:r>
         <w:t xml:space="preserve">Table </w:t>
@@ -5024,15 +4970,15 @@
     </w:p>
     <w:tbl>
       <w:tblPr>
-        <w:tblStyle w:val="Tabellenraster"/>
+        <w:tblStyle w:val="TableGrid"/>
         <w:tblW w:w="0" w:type="auto"/>
         <w:tblLook w:val="04A0" w:firstRow="1" w:lastRow="0" w:firstColumn="1" w:lastColumn="0" w:noHBand="0" w:noVBand="1"/>
       </w:tblPr>
       <w:tblGrid>
         <w:gridCol w:w="2268"/>
         <w:gridCol w:w="1593"/>
-        <w:gridCol w:w="2059"/>
-        <w:gridCol w:w="2059"/>
+        <w:gridCol w:w="2056"/>
+        <w:gridCol w:w="2055"/>
         <w:gridCol w:w="1417"/>
       </w:tblGrid>
       <w:tr>
@@ -5414,13 +5360,8 @@
         </w:rPr>
         <w:t xml:space="preserve"> </w:t>
       </w:r>
-      <w:proofErr w:type="gramStart"/>
-      <w:r>
-        <w:t>%}{</w:t>
-      </w:r>
-      <w:proofErr w:type="gramEnd"/>
-      <w:r>
-        <w:t>{</w:t>
+      <w:r>
+        <w:t>%}{{</w:t>
       </w:r>
       <w:r>
         <w:t xml:space="preserve">r </w:t>
@@ -5510,7 +5451,7 @@
 </file>
 
 <file path=word/endnotes.xml><?xml version="1.0" encoding="utf-8"?>
-<w:endnotes xmlns:wpc="http://schemas.microsoft.com/office/word/2010/wordprocessingCanvas" xmlns:cx="http://schemas.microsoft.com/office/drawing/2014/chartex" xmlns:cx1="http://schemas.microsoft.com/office/drawing/2015/9/8/chartex" xmlns:cx2="http://schemas.microsoft.com/office/drawing/2015/10/21/chartex" xmlns:cx3="http://schemas.microsoft.com/office/drawing/2016/5/9/chartex" xmlns:cx4="http://schemas.microsoft.com/office/drawing/2016/5/10/chartex" xmlns:cx5="http://schemas.microsoft.com/office/drawing/2016/5/11/chartex" xmlns:cx6="http://schemas.microsoft.com/office/drawing/2016/5/12/chartex" xmlns:cx7="http://schemas.microsoft.com/office/drawing/2016/5/13/chartex" xmlns:cx8="http://schemas.microsoft.com/office/drawing/2016/5/14/chartex" xmlns:mc="http://schemas.openxmlformats.org/markup-compatibility/2006" xmlns:aink="http://schemas.microsoft.com/office/drawing/2016/ink" xmlns:am3d="http://schemas.microsoft.com/office/drawing/2017/model3d" xmlns:o="urn:schemas-microsoft-com:office:office" xmlns:oel="http://schemas.microsoft.com/office/2019/extlst" xmlns:r="http://schemas.openxmlformats.org/officeDocument/2006/relationships" xmlns:m="http://schemas.openxmlformats.org/officeDocument/2006/math" xmlns:v="urn:schemas-microsoft-com:vml" xmlns:wp14="http://schemas.microsoft.com/office/word/2010/wordprocessingDrawing" xmlns:wp="http://schemas.openxmlformats.org/drawingml/2006/wordprocessingDrawing" xmlns:w10="urn:schemas-microsoft-com:office:word" xmlns:w="http://schemas.openxmlformats.org/wordprocessingml/2006/main" xmlns:w14="http://schemas.microsoft.com/office/word/2010/wordml" xmlns:w15="http://schemas.microsoft.com/office/word/2012/wordml" xmlns:w16cex="http://schemas.microsoft.com/office/word/2018/wordml/cex" xmlns:w16cid="http://schemas.microsoft.com/office/word/2016/wordml/cid" xmlns:w16="http://schemas.microsoft.com/office/word/2018/wordml" xmlns:w16sdtdh="http://schemas.microsoft.com/office/word/2020/wordml/sdtdatahash" xmlns:w16se="http://schemas.microsoft.com/office/word/2015/wordml/symex" xmlns:wpg="http://schemas.microsoft.com/office/word/2010/wordprocessingGroup" xmlns:wpi="http://schemas.microsoft.com/office/word/2010/wordprocessingInk" xmlns:wne="http://schemas.microsoft.com/office/word/2006/wordml" xmlns:wps="http://schemas.microsoft.com/office/word/2010/wordprocessingShape" mc:Ignorable="w14 w15 w16se w16cid w16 w16cex w16sdtdh wp14">
+<w:endnotes xmlns:wpc="http://schemas.microsoft.com/office/word/2010/wordprocessingCanvas" xmlns:cx="http://schemas.microsoft.com/office/drawing/2014/chartex" xmlns:cx1="http://schemas.microsoft.com/office/drawing/2015/9/8/chartex" xmlns:cx2="http://schemas.microsoft.com/office/drawing/2015/10/21/chartex" xmlns:cx3="http://schemas.microsoft.com/office/drawing/2016/5/9/chartex" xmlns:cx4="http://schemas.microsoft.com/office/drawing/2016/5/10/chartex" xmlns:cx5="http://schemas.microsoft.com/office/drawing/2016/5/11/chartex" xmlns:cx6="http://schemas.microsoft.com/office/drawing/2016/5/12/chartex" xmlns:cx7="http://schemas.microsoft.com/office/drawing/2016/5/13/chartex" xmlns:cx8="http://schemas.microsoft.com/office/drawing/2016/5/14/chartex" xmlns:mc="http://schemas.openxmlformats.org/markup-compatibility/2006" xmlns:aink="http://schemas.microsoft.com/office/drawing/2016/ink" xmlns:am3d="http://schemas.microsoft.com/office/drawing/2017/model3d" xmlns:o="urn:schemas-microsoft-com:office:office" xmlns:oel="http://schemas.microsoft.com/office/2019/extlst" xmlns:r="http://schemas.openxmlformats.org/officeDocument/2006/relationships" xmlns:m="http://schemas.openxmlformats.org/officeDocument/2006/math" xmlns:v="urn:schemas-microsoft-com:vml" xmlns:wp14="http://schemas.microsoft.com/office/word/2010/wordprocessingDrawing" xmlns:wp="http://schemas.openxmlformats.org/drawingml/2006/wordprocessingDrawing" xmlns:w10="urn:schemas-microsoft-com:office:word" xmlns:w="http://schemas.openxmlformats.org/wordprocessingml/2006/main" xmlns:w14="http://schemas.microsoft.com/office/word/2010/wordml" xmlns:w15="http://schemas.microsoft.com/office/word/2012/wordml" xmlns:w16cex="http://schemas.microsoft.com/office/word/2018/wordml/cex" xmlns:w16cid="http://schemas.microsoft.com/office/word/2016/wordml/cid" xmlns:w16="http://schemas.microsoft.com/office/word/2018/wordml" xmlns:w16du="http://schemas.microsoft.com/office/word/2023/wordml/word16du" xmlns:w16sdtdh="http://schemas.microsoft.com/office/word/2020/wordml/sdtdatahash" xmlns:w16sdtfl="http://schemas.microsoft.com/office/word/2024/wordml/sdtformatlock" xmlns:w16se="http://schemas.microsoft.com/office/word/2015/wordml/symex" xmlns:wpg="http://schemas.microsoft.com/office/word/2010/wordprocessingGroup" xmlns:wpi="http://schemas.microsoft.com/office/word/2010/wordprocessingInk" xmlns:wne="http://schemas.microsoft.com/office/word/2006/wordml" xmlns:wps="http://schemas.microsoft.com/office/word/2010/wordprocessingShape" mc:Ignorable="w14 w15 w16se w16cid w16 w16cex w16sdtdh w16sdtfl w16du wp14">
   <w:endnote w:type="separator" w:id="-1">
     <w:p>
       <w:pPr>
@@ -5535,37 +5476,37 @@
 </file>
 
 <file path=word/footer1.xml><?xml version="1.0" encoding="utf-8"?>
-<w:ftr xmlns:wpc="http://schemas.microsoft.com/office/word/2010/wordprocessingCanvas" xmlns:cx="http://schemas.microsoft.com/office/drawing/2014/chartex" xmlns:cx1="http://schemas.microsoft.com/office/drawing/2015/9/8/chartex" xmlns:cx2="http://schemas.microsoft.com/office/drawing/2015/10/21/chartex" xmlns:cx3="http://schemas.microsoft.com/office/drawing/2016/5/9/chartex" xmlns:cx4="http://schemas.microsoft.com/office/drawing/2016/5/10/chartex" xmlns:cx5="http://schemas.microsoft.com/office/drawing/2016/5/11/chartex" xmlns:cx6="http://schemas.microsoft.com/office/drawing/2016/5/12/chartex" xmlns:cx7="http://schemas.microsoft.com/office/drawing/2016/5/13/chartex" xmlns:cx8="http://schemas.microsoft.com/office/drawing/2016/5/14/chartex" xmlns:mc="http://schemas.openxmlformats.org/markup-compatibility/2006" xmlns:aink="http://schemas.microsoft.com/office/drawing/2016/ink" xmlns:am3d="http://schemas.microsoft.com/office/drawing/2017/model3d" xmlns:o="urn:schemas-microsoft-com:office:office" xmlns:oel="http://schemas.microsoft.com/office/2019/extlst" xmlns:r="http://schemas.openxmlformats.org/officeDocument/2006/relationships" xmlns:m="http://schemas.openxmlformats.org/officeDocument/2006/math" xmlns:v="urn:schemas-microsoft-com:vml" xmlns:wp14="http://schemas.microsoft.com/office/word/2010/wordprocessingDrawing" xmlns:wp="http://schemas.openxmlformats.org/drawingml/2006/wordprocessingDrawing" xmlns:w10="urn:schemas-microsoft-com:office:word" xmlns:w="http://schemas.openxmlformats.org/wordprocessingml/2006/main" xmlns:w14="http://schemas.microsoft.com/office/word/2010/wordml" xmlns:w15="http://schemas.microsoft.com/office/word/2012/wordml" xmlns:w16cex="http://schemas.microsoft.com/office/word/2018/wordml/cex" xmlns:w16cid="http://schemas.microsoft.com/office/word/2016/wordml/cid" xmlns:w16="http://schemas.microsoft.com/office/word/2018/wordml" xmlns:w16sdtdh="http://schemas.microsoft.com/office/word/2020/wordml/sdtdatahash" xmlns:w16se="http://schemas.microsoft.com/office/word/2015/wordml/symex" xmlns:wpg="http://schemas.microsoft.com/office/word/2010/wordprocessingGroup" xmlns:wpi="http://schemas.microsoft.com/office/word/2010/wordprocessingInk" xmlns:wne="http://schemas.microsoft.com/office/word/2006/wordml" xmlns:wps="http://schemas.microsoft.com/office/word/2010/wordprocessingShape" mc:Ignorable="w14 w15 w16se w16cid w16 w16cex w16sdtdh wp14">
+<w:ftr xmlns:wpc="http://schemas.microsoft.com/office/word/2010/wordprocessingCanvas" xmlns:cx="http://schemas.microsoft.com/office/drawing/2014/chartex" xmlns:cx1="http://schemas.microsoft.com/office/drawing/2015/9/8/chartex" xmlns:cx2="http://schemas.microsoft.com/office/drawing/2015/10/21/chartex" xmlns:cx3="http://schemas.microsoft.com/office/drawing/2016/5/9/chartex" xmlns:cx4="http://schemas.microsoft.com/office/drawing/2016/5/10/chartex" xmlns:cx5="http://schemas.microsoft.com/office/drawing/2016/5/11/chartex" xmlns:cx6="http://schemas.microsoft.com/office/drawing/2016/5/12/chartex" xmlns:cx7="http://schemas.microsoft.com/office/drawing/2016/5/13/chartex" xmlns:cx8="http://schemas.microsoft.com/office/drawing/2016/5/14/chartex" xmlns:mc="http://schemas.openxmlformats.org/markup-compatibility/2006" xmlns:aink="http://schemas.microsoft.com/office/drawing/2016/ink" xmlns:am3d="http://schemas.microsoft.com/office/drawing/2017/model3d" xmlns:o="urn:schemas-microsoft-com:office:office" xmlns:oel="http://schemas.microsoft.com/office/2019/extlst" xmlns:r="http://schemas.openxmlformats.org/officeDocument/2006/relationships" xmlns:m="http://schemas.openxmlformats.org/officeDocument/2006/math" xmlns:v="urn:schemas-microsoft-com:vml" xmlns:wp14="http://schemas.microsoft.com/office/word/2010/wordprocessingDrawing" xmlns:wp="http://schemas.openxmlformats.org/drawingml/2006/wordprocessingDrawing" xmlns:w10="urn:schemas-microsoft-com:office:word" xmlns:w="http://schemas.openxmlformats.org/wordprocessingml/2006/main" xmlns:w14="http://schemas.microsoft.com/office/word/2010/wordml" xmlns:w15="http://schemas.microsoft.com/office/word/2012/wordml" xmlns:w16cex="http://schemas.microsoft.com/office/word/2018/wordml/cex" xmlns:w16cid="http://schemas.microsoft.com/office/word/2016/wordml/cid" xmlns:w16="http://schemas.microsoft.com/office/word/2018/wordml" xmlns:w16du="http://schemas.microsoft.com/office/word/2023/wordml/word16du" xmlns:w16sdtdh="http://schemas.microsoft.com/office/word/2020/wordml/sdtdatahash" xmlns:w16sdtfl="http://schemas.microsoft.com/office/word/2024/wordml/sdtformatlock" xmlns:w16se="http://schemas.microsoft.com/office/word/2015/wordml/symex" xmlns:wpg="http://schemas.microsoft.com/office/word/2010/wordprocessingGroup" xmlns:wpi="http://schemas.microsoft.com/office/word/2010/wordprocessingInk" xmlns:wne="http://schemas.microsoft.com/office/word/2006/wordml" xmlns:wps="http://schemas.microsoft.com/office/word/2010/wordprocessingShape" mc:Ignorable="w14 w15 w16se w16cid w16 w16cex w16sdtdh w16sdtfl w16du wp14">
   <w:p>
     <w:pPr>
-      <w:pStyle w:val="Fuzeile"/>
+      <w:pStyle w:val="Footer"/>
     </w:pPr>
   </w:p>
 </w:ftr>
 </file>
 
 <file path=word/footer2.xml><?xml version="1.0" encoding="utf-8"?>
-<w:ftr xmlns:wpc="http://schemas.microsoft.com/office/word/2010/wordprocessingCanvas" xmlns:cx="http://schemas.microsoft.com/office/drawing/2014/chartex" xmlns:cx1="http://schemas.microsoft.com/office/drawing/2015/9/8/chartex" xmlns:cx2="http://schemas.microsoft.com/office/drawing/2015/10/21/chartex" xmlns:cx3="http://schemas.microsoft.com/office/drawing/2016/5/9/chartex" xmlns:cx4="http://schemas.microsoft.com/office/drawing/2016/5/10/chartex" xmlns:cx5="http://schemas.microsoft.com/office/drawing/2016/5/11/chartex" xmlns:cx6="http://schemas.microsoft.com/office/drawing/2016/5/12/chartex" xmlns:cx7="http://schemas.microsoft.com/office/drawing/2016/5/13/chartex" xmlns:cx8="http://schemas.microsoft.com/office/drawing/2016/5/14/chartex" xmlns:mc="http://schemas.openxmlformats.org/markup-compatibility/2006" xmlns:aink="http://schemas.microsoft.com/office/drawing/2016/ink" xmlns:am3d="http://schemas.microsoft.com/office/drawing/2017/model3d" xmlns:o="urn:schemas-microsoft-com:office:office" xmlns:oel="http://schemas.microsoft.com/office/2019/extlst" xmlns:r="http://schemas.openxmlformats.org/officeDocument/2006/relationships" xmlns:m="http://schemas.openxmlformats.org/officeDocument/2006/math" xmlns:v="urn:schemas-microsoft-com:vml" xmlns:wp14="http://schemas.microsoft.com/office/word/2010/wordprocessingDrawing" xmlns:wp="http://schemas.openxmlformats.org/drawingml/2006/wordprocessingDrawing" xmlns:w10="urn:schemas-microsoft-com:office:word" xmlns:w="http://schemas.openxmlformats.org/wordprocessingml/2006/main" xmlns:w14="http://schemas.microsoft.com/office/word/2010/wordml" xmlns:w15="http://schemas.microsoft.com/office/word/2012/wordml" xmlns:w16cex="http://schemas.microsoft.com/office/word/2018/wordml/cex" xmlns:w16cid="http://schemas.microsoft.com/office/word/2016/wordml/cid" xmlns:w16="http://schemas.microsoft.com/office/word/2018/wordml" xmlns:w16sdtdh="http://schemas.microsoft.com/office/word/2020/wordml/sdtdatahash" xmlns:w16se="http://schemas.microsoft.com/office/word/2015/wordml/symex" xmlns:wpg="http://schemas.microsoft.com/office/word/2010/wordprocessingGroup" xmlns:wpi="http://schemas.microsoft.com/office/word/2010/wordprocessingInk" xmlns:wne="http://schemas.microsoft.com/office/word/2006/wordml" xmlns:wps="http://schemas.microsoft.com/office/word/2010/wordprocessingShape" mc:Ignorable="w14 w15 w16se w16cid w16 w16cex w16sdtdh wp14">
+<w:ftr xmlns:wpc="http://schemas.microsoft.com/office/word/2010/wordprocessingCanvas" xmlns:cx="http://schemas.microsoft.com/office/drawing/2014/chartex" xmlns:cx1="http://schemas.microsoft.com/office/drawing/2015/9/8/chartex" xmlns:cx2="http://schemas.microsoft.com/office/drawing/2015/10/21/chartex" xmlns:cx3="http://schemas.microsoft.com/office/drawing/2016/5/9/chartex" xmlns:cx4="http://schemas.microsoft.com/office/drawing/2016/5/10/chartex" xmlns:cx5="http://schemas.microsoft.com/office/drawing/2016/5/11/chartex" xmlns:cx6="http://schemas.microsoft.com/office/drawing/2016/5/12/chartex" xmlns:cx7="http://schemas.microsoft.com/office/drawing/2016/5/13/chartex" xmlns:cx8="http://schemas.microsoft.com/office/drawing/2016/5/14/chartex" xmlns:mc="http://schemas.openxmlformats.org/markup-compatibility/2006" xmlns:aink="http://schemas.microsoft.com/office/drawing/2016/ink" xmlns:am3d="http://schemas.microsoft.com/office/drawing/2017/model3d" xmlns:o="urn:schemas-microsoft-com:office:office" xmlns:oel="http://schemas.microsoft.com/office/2019/extlst" xmlns:r="http://schemas.openxmlformats.org/officeDocument/2006/relationships" xmlns:m="http://schemas.openxmlformats.org/officeDocument/2006/math" xmlns:v="urn:schemas-microsoft-com:vml" xmlns:wp14="http://schemas.microsoft.com/office/word/2010/wordprocessingDrawing" xmlns:wp="http://schemas.openxmlformats.org/drawingml/2006/wordprocessingDrawing" xmlns:w10="urn:schemas-microsoft-com:office:word" xmlns:w="http://schemas.openxmlformats.org/wordprocessingml/2006/main" xmlns:w14="http://schemas.microsoft.com/office/word/2010/wordml" xmlns:w15="http://schemas.microsoft.com/office/word/2012/wordml" xmlns:w16cex="http://schemas.microsoft.com/office/word/2018/wordml/cex" xmlns:w16cid="http://schemas.microsoft.com/office/word/2016/wordml/cid" xmlns:w16="http://schemas.microsoft.com/office/word/2018/wordml" xmlns:w16du="http://schemas.microsoft.com/office/word/2023/wordml/word16du" xmlns:w16sdtdh="http://schemas.microsoft.com/office/word/2020/wordml/sdtdatahash" xmlns:w16sdtfl="http://schemas.microsoft.com/office/word/2024/wordml/sdtformatlock" xmlns:w16se="http://schemas.microsoft.com/office/word/2015/wordml/symex" xmlns:wpg="http://schemas.microsoft.com/office/word/2010/wordprocessingGroup" xmlns:wpi="http://schemas.microsoft.com/office/word/2010/wordprocessingInk" xmlns:wne="http://schemas.microsoft.com/office/word/2006/wordml" xmlns:wps="http://schemas.microsoft.com/office/word/2010/wordprocessingShape" mc:Ignorable="w14 w15 w16se w16cid w16 w16cex w16sdtdh w16sdtfl w16du wp14">
   <w:p>
     <w:pPr>
-      <w:pStyle w:val="Fuzeile"/>
+      <w:pStyle w:val="Footer"/>
     </w:pPr>
   </w:p>
 </w:ftr>
 </file>
 
 <file path=word/footer3.xml><?xml version="1.0" encoding="utf-8"?>
-<w:ftr xmlns:wpc="http://schemas.microsoft.com/office/word/2010/wordprocessingCanvas" xmlns:cx="http://schemas.microsoft.com/office/drawing/2014/chartex" xmlns:cx1="http://schemas.microsoft.com/office/drawing/2015/9/8/chartex" xmlns:cx2="http://schemas.microsoft.com/office/drawing/2015/10/21/chartex" xmlns:cx3="http://schemas.microsoft.com/office/drawing/2016/5/9/chartex" xmlns:cx4="http://schemas.microsoft.com/office/drawing/2016/5/10/chartex" xmlns:cx5="http://schemas.microsoft.com/office/drawing/2016/5/11/chartex" xmlns:cx6="http://schemas.microsoft.com/office/drawing/2016/5/12/chartex" xmlns:cx7="http://schemas.microsoft.com/office/drawing/2016/5/13/chartex" xmlns:cx8="http://schemas.microsoft.com/office/drawing/2016/5/14/chartex" xmlns:mc="http://schemas.openxmlformats.org/markup-compatibility/2006" xmlns:aink="http://schemas.microsoft.com/office/drawing/2016/ink" xmlns:am3d="http://schemas.microsoft.com/office/drawing/2017/model3d" xmlns:o="urn:schemas-microsoft-com:office:office" xmlns:oel="http://schemas.microsoft.com/office/2019/extlst" xmlns:r="http://schemas.openxmlformats.org/officeDocument/2006/relationships" xmlns:m="http://schemas.openxmlformats.org/officeDocument/2006/math" xmlns:v="urn:schemas-microsoft-com:vml" xmlns:wp14="http://schemas.microsoft.com/office/word/2010/wordprocessingDrawing" xmlns:wp="http://schemas.openxmlformats.org/drawingml/2006/wordprocessingDrawing" xmlns:w10="urn:schemas-microsoft-com:office:word" xmlns:w="http://schemas.openxmlformats.org/wordprocessingml/2006/main" xmlns:w14="http://schemas.microsoft.com/office/word/2010/wordml" xmlns:w15="http://schemas.microsoft.com/office/word/2012/wordml" xmlns:w16cex="http://schemas.microsoft.com/office/word/2018/wordml/cex" xmlns:w16cid="http://schemas.microsoft.com/office/word/2016/wordml/cid" xmlns:w16="http://schemas.microsoft.com/office/word/2018/wordml" xmlns:w16sdtdh="http://schemas.microsoft.com/office/word/2020/wordml/sdtdatahash" xmlns:w16se="http://schemas.microsoft.com/office/word/2015/wordml/symex" xmlns:wpg="http://schemas.microsoft.com/office/word/2010/wordprocessingGroup" xmlns:wpi="http://schemas.microsoft.com/office/word/2010/wordprocessingInk" xmlns:wne="http://schemas.microsoft.com/office/word/2006/wordml" xmlns:wps="http://schemas.microsoft.com/office/word/2010/wordprocessingShape" mc:Ignorable="w14 w15 w16se w16cid w16 w16cex w16sdtdh wp14">
+<w:ftr xmlns:wpc="http://schemas.microsoft.com/office/word/2010/wordprocessingCanvas" xmlns:cx="http://schemas.microsoft.com/office/drawing/2014/chartex" xmlns:cx1="http://schemas.microsoft.com/office/drawing/2015/9/8/chartex" xmlns:cx2="http://schemas.microsoft.com/office/drawing/2015/10/21/chartex" xmlns:cx3="http://schemas.microsoft.com/office/drawing/2016/5/9/chartex" xmlns:cx4="http://schemas.microsoft.com/office/drawing/2016/5/10/chartex" xmlns:cx5="http://schemas.microsoft.com/office/drawing/2016/5/11/chartex" xmlns:cx6="http://schemas.microsoft.com/office/drawing/2016/5/12/chartex" xmlns:cx7="http://schemas.microsoft.com/office/drawing/2016/5/13/chartex" xmlns:cx8="http://schemas.microsoft.com/office/drawing/2016/5/14/chartex" xmlns:mc="http://schemas.openxmlformats.org/markup-compatibility/2006" xmlns:aink="http://schemas.microsoft.com/office/drawing/2016/ink" xmlns:am3d="http://schemas.microsoft.com/office/drawing/2017/model3d" xmlns:o="urn:schemas-microsoft-com:office:office" xmlns:oel="http://schemas.microsoft.com/office/2019/extlst" xmlns:r="http://schemas.openxmlformats.org/officeDocument/2006/relationships" xmlns:m="http://schemas.openxmlformats.org/officeDocument/2006/math" xmlns:v="urn:schemas-microsoft-com:vml" xmlns:wp14="http://schemas.microsoft.com/office/word/2010/wordprocessingDrawing" xmlns:wp="http://schemas.openxmlformats.org/drawingml/2006/wordprocessingDrawing" xmlns:w10="urn:schemas-microsoft-com:office:word" xmlns:w="http://schemas.openxmlformats.org/wordprocessingml/2006/main" xmlns:w14="http://schemas.microsoft.com/office/word/2010/wordml" xmlns:w15="http://schemas.microsoft.com/office/word/2012/wordml" xmlns:w16cex="http://schemas.microsoft.com/office/word/2018/wordml/cex" xmlns:w16cid="http://schemas.microsoft.com/office/word/2016/wordml/cid" xmlns:w16="http://schemas.microsoft.com/office/word/2018/wordml" xmlns:w16du="http://schemas.microsoft.com/office/word/2023/wordml/word16du" xmlns:w16sdtdh="http://schemas.microsoft.com/office/word/2020/wordml/sdtdatahash" xmlns:w16sdtfl="http://schemas.microsoft.com/office/word/2024/wordml/sdtformatlock" xmlns:w16se="http://schemas.microsoft.com/office/word/2015/wordml/symex" xmlns:wpg="http://schemas.microsoft.com/office/word/2010/wordprocessingGroup" xmlns:wpi="http://schemas.microsoft.com/office/word/2010/wordprocessingInk" xmlns:wne="http://schemas.microsoft.com/office/word/2006/wordml" xmlns:wps="http://schemas.microsoft.com/office/word/2010/wordprocessingShape" mc:Ignorable="w14 w15 w16se w16cid w16 w16cex w16sdtdh w16sdtfl w16du wp14">
   <w:p>
     <w:pPr>
-      <w:pStyle w:val="Fuzeile"/>
+      <w:pStyle w:val="Footer"/>
     </w:pPr>
   </w:p>
 </w:ftr>
 </file>
 
 <file path=word/footnotes.xml><?xml version="1.0" encoding="utf-8"?>
-<w:footnotes xmlns:wpc="http://schemas.microsoft.com/office/word/2010/wordprocessingCanvas" xmlns:cx="http://schemas.microsoft.com/office/drawing/2014/chartex" xmlns:cx1="http://schemas.microsoft.com/office/drawing/2015/9/8/chartex" xmlns:cx2="http://schemas.microsoft.com/office/drawing/2015/10/21/chartex" xmlns:cx3="http://schemas.microsoft.com/office/drawing/2016/5/9/chartex" xmlns:cx4="http://schemas.microsoft.com/office/drawing/2016/5/10/chartex" xmlns:cx5="http://schemas.microsoft.com/office/drawing/2016/5/11/chartex" xmlns:cx6="http://schemas.microsoft.com/office/drawing/2016/5/12/chartex" xmlns:cx7="http://schemas.microsoft.com/office/drawing/2016/5/13/chartex" xmlns:cx8="http://schemas.microsoft.com/office/drawing/2016/5/14/chartex" xmlns:mc="http://schemas.openxmlformats.org/markup-compatibility/2006" xmlns:aink="http://schemas.microsoft.com/office/drawing/2016/ink" xmlns:am3d="http://schemas.microsoft.com/office/drawing/2017/model3d" xmlns:o="urn:schemas-microsoft-com:office:office" xmlns:oel="http://schemas.microsoft.com/office/2019/extlst" xmlns:r="http://schemas.openxmlformats.org/officeDocument/2006/relationships" xmlns:m="http://schemas.openxmlformats.org/officeDocument/2006/math" xmlns:v="urn:schemas-microsoft-com:vml" xmlns:wp14="http://schemas.microsoft.com/office/word/2010/wordprocessingDrawing" xmlns:wp="http://schemas.openxmlformats.org/drawingml/2006/wordprocessingDrawing" xmlns:w10="urn:schemas-microsoft-com:office:word" xmlns:w="http://schemas.openxmlformats.org/wordprocessingml/2006/main" xmlns:w14="http://schemas.microsoft.com/office/word/2010/wordml" xmlns:w15="http://schemas.microsoft.com/office/word/2012/wordml" xmlns:w16cex="http://schemas.microsoft.com/office/word/2018/wordml/cex" xmlns:w16cid="http://schemas.microsoft.com/office/word/2016/wordml/cid" xmlns:w16="http://schemas.microsoft.com/office/word/2018/wordml" xmlns:w16sdtdh="http://schemas.microsoft.com/office/word/2020/wordml/sdtdatahash" xmlns:w16se="http://schemas.microsoft.com/office/word/2015/wordml/symex" xmlns:wpg="http://schemas.microsoft.com/office/word/2010/wordprocessingGroup" xmlns:wpi="http://schemas.microsoft.com/office/word/2010/wordprocessingInk" xmlns:wne="http://schemas.microsoft.com/office/word/2006/wordml" xmlns:wps="http://schemas.microsoft.com/office/word/2010/wordprocessingShape" mc:Ignorable="w14 w15 w16se w16cid w16 w16cex w16sdtdh wp14">
+<w:footnotes xmlns:wpc="http://schemas.microsoft.com/office/word/2010/wordprocessingCanvas" xmlns:cx="http://schemas.microsoft.com/office/drawing/2014/chartex" xmlns:cx1="http://schemas.microsoft.com/office/drawing/2015/9/8/chartex" xmlns:cx2="http://schemas.microsoft.com/office/drawing/2015/10/21/chartex" xmlns:cx3="http://schemas.microsoft.com/office/drawing/2016/5/9/chartex" xmlns:cx4="http://schemas.microsoft.com/office/drawing/2016/5/10/chartex" xmlns:cx5="http://schemas.microsoft.com/office/drawing/2016/5/11/chartex" xmlns:cx6="http://schemas.microsoft.com/office/drawing/2016/5/12/chartex" xmlns:cx7="http://schemas.microsoft.com/office/drawing/2016/5/13/chartex" xmlns:cx8="http://schemas.microsoft.com/office/drawing/2016/5/14/chartex" xmlns:mc="http://schemas.openxmlformats.org/markup-compatibility/2006" xmlns:aink="http://schemas.microsoft.com/office/drawing/2016/ink" xmlns:am3d="http://schemas.microsoft.com/office/drawing/2017/model3d" xmlns:o="urn:schemas-microsoft-com:office:office" xmlns:oel="http://schemas.microsoft.com/office/2019/extlst" xmlns:r="http://schemas.openxmlformats.org/officeDocument/2006/relationships" xmlns:m="http://schemas.openxmlformats.org/officeDocument/2006/math" xmlns:v="urn:schemas-microsoft-com:vml" xmlns:wp14="http://schemas.microsoft.com/office/word/2010/wordprocessingDrawing" xmlns:wp="http://schemas.openxmlformats.org/drawingml/2006/wordprocessingDrawing" xmlns:w10="urn:schemas-microsoft-com:office:word" xmlns:w="http://schemas.openxmlformats.org/wordprocessingml/2006/main" xmlns:w14="http://schemas.microsoft.com/office/word/2010/wordml" xmlns:w15="http://schemas.microsoft.com/office/word/2012/wordml" xmlns:w16cex="http://schemas.microsoft.com/office/word/2018/wordml/cex" xmlns:w16cid="http://schemas.microsoft.com/office/word/2016/wordml/cid" xmlns:w16="http://schemas.microsoft.com/office/word/2018/wordml" xmlns:w16du="http://schemas.microsoft.com/office/word/2023/wordml/word16du" xmlns:w16sdtdh="http://schemas.microsoft.com/office/word/2020/wordml/sdtdatahash" xmlns:w16sdtfl="http://schemas.microsoft.com/office/word/2024/wordml/sdtformatlock" xmlns:w16se="http://schemas.microsoft.com/office/word/2015/wordml/symex" xmlns:wpg="http://schemas.microsoft.com/office/word/2010/wordprocessingGroup" xmlns:wpi="http://schemas.microsoft.com/office/word/2010/wordprocessingInk" xmlns:wne="http://schemas.microsoft.com/office/word/2006/wordml" xmlns:wps="http://schemas.microsoft.com/office/word/2010/wordprocessingShape" mc:Ignorable="w14 w15 w16se w16cid w16 w16cex w16sdtdh w16sdtfl w16du wp14">
   <w:footnote w:type="separator" w:id="-1">
     <w:p>
       <w:pPr>
@@ -5590,37 +5531,37 @@
 </file>
 
 <file path=word/header1.xml><?xml version="1.0" encoding="utf-8"?>
-<w:hdr xmlns:wpc="http://schemas.microsoft.com/office/word/2010/wordprocessingCanvas" xmlns:cx="http://schemas.microsoft.com/office/drawing/2014/chartex" xmlns:cx1="http://schemas.microsoft.com/office/drawing/2015/9/8/chartex" xmlns:cx2="http://schemas.microsoft.com/office/drawing/2015/10/21/chartex" xmlns:cx3="http://schemas.microsoft.com/office/drawing/2016/5/9/chartex" xmlns:cx4="http://schemas.microsoft.com/office/drawing/2016/5/10/chartex" xmlns:cx5="http://schemas.microsoft.com/office/drawing/2016/5/11/chartex" xmlns:cx6="http://schemas.microsoft.com/office/drawing/2016/5/12/chartex" xmlns:cx7="http://schemas.microsoft.com/office/drawing/2016/5/13/chartex" xmlns:cx8="http://schemas.microsoft.com/office/drawing/2016/5/14/chartex" xmlns:mc="http://schemas.openxmlformats.org/markup-compatibility/2006" xmlns:aink="http://schemas.microsoft.com/office/drawing/2016/ink" xmlns:am3d="http://schemas.microsoft.com/office/drawing/2017/model3d" xmlns:o="urn:schemas-microsoft-com:office:office" xmlns:oel="http://schemas.microsoft.com/office/2019/extlst" xmlns:r="http://schemas.openxmlformats.org/officeDocument/2006/relationships" xmlns:m="http://schemas.openxmlformats.org/officeDocument/2006/math" xmlns:v="urn:schemas-microsoft-com:vml" xmlns:wp14="http://schemas.microsoft.com/office/word/2010/wordprocessingDrawing" xmlns:wp="http://schemas.openxmlformats.org/drawingml/2006/wordprocessingDrawing" xmlns:w10="urn:schemas-microsoft-com:office:word" xmlns:w="http://schemas.openxmlformats.org/wordprocessingml/2006/main" xmlns:w14="http://schemas.microsoft.com/office/word/2010/wordml" xmlns:w15="http://schemas.microsoft.com/office/word/2012/wordml" xmlns:w16cex="http://schemas.microsoft.com/office/word/2018/wordml/cex" xmlns:w16cid="http://schemas.microsoft.com/office/word/2016/wordml/cid" xmlns:w16="http://schemas.microsoft.com/office/word/2018/wordml" xmlns:w16sdtdh="http://schemas.microsoft.com/office/word/2020/wordml/sdtdatahash" xmlns:w16se="http://schemas.microsoft.com/office/word/2015/wordml/symex" xmlns:wpg="http://schemas.microsoft.com/office/word/2010/wordprocessingGroup" xmlns:wpi="http://schemas.microsoft.com/office/word/2010/wordprocessingInk" xmlns:wne="http://schemas.microsoft.com/office/word/2006/wordml" xmlns:wps="http://schemas.microsoft.com/office/word/2010/wordprocessingShape" mc:Ignorable="w14 w15 w16se w16cid w16 w16cex w16sdtdh wp14">
+<w:hdr xmlns:wpc="http://schemas.microsoft.com/office/word/2010/wordprocessingCanvas" xmlns:cx="http://schemas.microsoft.com/office/drawing/2014/chartex" xmlns:cx1="http://schemas.microsoft.com/office/drawing/2015/9/8/chartex" xmlns:cx2="http://schemas.microsoft.com/office/drawing/2015/10/21/chartex" xmlns:cx3="http://schemas.microsoft.com/office/drawing/2016/5/9/chartex" xmlns:cx4="http://schemas.microsoft.com/office/drawing/2016/5/10/chartex" xmlns:cx5="http://schemas.microsoft.com/office/drawing/2016/5/11/chartex" xmlns:cx6="http://schemas.microsoft.com/office/drawing/2016/5/12/chartex" xmlns:cx7="http://schemas.microsoft.com/office/drawing/2016/5/13/chartex" xmlns:cx8="http://schemas.microsoft.com/office/drawing/2016/5/14/chartex" xmlns:mc="http://schemas.openxmlformats.org/markup-compatibility/2006" xmlns:aink="http://schemas.microsoft.com/office/drawing/2016/ink" xmlns:am3d="http://schemas.microsoft.com/office/drawing/2017/model3d" xmlns:o="urn:schemas-microsoft-com:office:office" xmlns:oel="http://schemas.microsoft.com/office/2019/extlst" xmlns:r="http://schemas.openxmlformats.org/officeDocument/2006/relationships" xmlns:m="http://schemas.openxmlformats.org/officeDocument/2006/math" xmlns:v="urn:schemas-microsoft-com:vml" xmlns:wp14="http://schemas.microsoft.com/office/word/2010/wordprocessingDrawing" xmlns:wp="http://schemas.openxmlformats.org/drawingml/2006/wordprocessingDrawing" xmlns:w10="urn:schemas-microsoft-com:office:word" xmlns:w="http://schemas.openxmlformats.org/wordprocessingml/2006/main" xmlns:w14="http://schemas.microsoft.com/office/word/2010/wordml" xmlns:w15="http://schemas.microsoft.com/office/word/2012/wordml" xmlns:w16cex="http://schemas.microsoft.com/office/word/2018/wordml/cex" xmlns:w16cid="http://schemas.microsoft.com/office/word/2016/wordml/cid" xmlns:w16="http://schemas.microsoft.com/office/word/2018/wordml" xmlns:w16du="http://schemas.microsoft.com/office/word/2023/wordml/word16du" xmlns:w16sdtdh="http://schemas.microsoft.com/office/word/2020/wordml/sdtdatahash" xmlns:w16sdtfl="http://schemas.microsoft.com/office/word/2024/wordml/sdtformatlock" xmlns:w16se="http://schemas.microsoft.com/office/word/2015/wordml/symex" xmlns:wpg="http://schemas.microsoft.com/office/word/2010/wordprocessingGroup" xmlns:wpi="http://schemas.microsoft.com/office/word/2010/wordprocessingInk" xmlns:wne="http://schemas.microsoft.com/office/word/2006/wordml" xmlns:wps="http://schemas.microsoft.com/office/word/2010/wordprocessingShape" mc:Ignorable="w14 w15 w16se w16cid w16 w16cex w16sdtdh w16sdtfl w16du wp14">
   <w:p>
     <w:pPr>
-      <w:pStyle w:val="Kopfzeile"/>
+      <w:pStyle w:val="Header"/>
     </w:pPr>
   </w:p>
 </w:hdr>
 </file>
 
 <file path=word/header2.xml><?xml version="1.0" encoding="utf-8"?>
-<w:hdr xmlns:wpc="http://schemas.microsoft.com/office/word/2010/wordprocessingCanvas" xmlns:cx="http://schemas.microsoft.com/office/drawing/2014/chartex" xmlns:cx1="http://schemas.microsoft.com/office/drawing/2015/9/8/chartex" xmlns:cx2="http://schemas.microsoft.com/office/drawing/2015/10/21/chartex" xmlns:cx3="http://schemas.microsoft.com/office/drawing/2016/5/9/chartex" xmlns:cx4="http://schemas.microsoft.com/office/drawing/2016/5/10/chartex" xmlns:cx5="http://schemas.microsoft.com/office/drawing/2016/5/11/chartex" xmlns:cx6="http://schemas.microsoft.com/office/drawing/2016/5/12/chartex" xmlns:cx7="http://schemas.microsoft.com/office/drawing/2016/5/13/chartex" xmlns:cx8="http://schemas.microsoft.com/office/drawing/2016/5/14/chartex" xmlns:mc="http://schemas.openxmlformats.org/markup-compatibility/2006" xmlns:aink="http://schemas.microsoft.com/office/drawing/2016/ink" xmlns:am3d="http://schemas.microsoft.com/office/drawing/2017/model3d" xmlns:o="urn:schemas-microsoft-com:office:office" xmlns:oel="http://schemas.microsoft.com/office/2019/extlst" xmlns:r="http://schemas.openxmlformats.org/officeDocument/2006/relationships" xmlns:m="http://schemas.openxmlformats.org/officeDocument/2006/math" xmlns:v="urn:schemas-microsoft-com:vml" xmlns:wp14="http://schemas.microsoft.com/office/word/2010/wordprocessingDrawing" xmlns:wp="http://schemas.openxmlformats.org/drawingml/2006/wordprocessingDrawing" xmlns:w10="urn:schemas-microsoft-com:office:word" xmlns:w="http://schemas.openxmlformats.org/wordprocessingml/2006/main" xmlns:w14="http://schemas.microsoft.com/office/word/2010/wordml" xmlns:w15="http://schemas.microsoft.com/office/word/2012/wordml" xmlns:w16cex="http://schemas.microsoft.com/office/word/2018/wordml/cex" xmlns:w16cid="http://schemas.microsoft.com/office/word/2016/wordml/cid" xmlns:w16="http://schemas.microsoft.com/office/word/2018/wordml" xmlns:w16sdtdh="http://schemas.microsoft.com/office/word/2020/wordml/sdtdatahash" xmlns:w16se="http://schemas.microsoft.com/office/word/2015/wordml/symex" xmlns:wpg="http://schemas.microsoft.com/office/word/2010/wordprocessingGroup" xmlns:wpi="http://schemas.microsoft.com/office/word/2010/wordprocessingInk" xmlns:wne="http://schemas.microsoft.com/office/word/2006/wordml" xmlns:wps="http://schemas.microsoft.com/office/word/2010/wordprocessingShape" mc:Ignorable="w14 w15 w16se w16cid w16 w16cex w16sdtdh wp14">
+<w:hdr xmlns:wpc="http://schemas.microsoft.com/office/word/2010/wordprocessingCanvas" xmlns:cx="http://schemas.microsoft.com/office/drawing/2014/chartex" xmlns:cx1="http://schemas.microsoft.com/office/drawing/2015/9/8/chartex" xmlns:cx2="http://schemas.microsoft.com/office/drawing/2015/10/21/chartex" xmlns:cx3="http://schemas.microsoft.com/office/drawing/2016/5/9/chartex" xmlns:cx4="http://schemas.microsoft.com/office/drawing/2016/5/10/chartex" xmlns:cx5="http://schemas.microsoft.com/office/drawing/2016/5/11/chartex" xmlns:cx6="http://schemas.microsoft.com/office/drawing/2016/5/12/chartex" xmlns:cx7="http://schemas.microsoft.com/office/drawing/2016/5/13/chartex" xmlns:cx8="http://schemas.microsoft.com/office/drawing/2016/5/14/chartex" xmlns:mc="http://schemas.openxmlformats.org/markup-compatibility/2006" xmlns:aink="http://schemas.microsoft.com/office/drawing/2016/ink" xmlns:am3d="http://schemas.microsoft.com/office/drawing/2017/model3d" xmlns:o="urn:schemas-microsoft-com:office:office" xmlns:oel="http://schemas.microsoft.com/office/2019/extlst" xmlns:r="http://schemas.openxmlformats.org/officeDocument/2006/relationships" xmlns:m="http://schemas.openxmlformats.org/officeDocument/2006/math" xmlns:v="urn:schemas-microsoft-com:vml" xmlns:wp14="http://schemas.microsoft.com/office/word/2010/wordprocessingDrawing" xmlns:wp="http://schemas.openxmlformats.org/drawingml/2006/wordprocessingDrawing" xmlns:w10="urn:schemas-microsoft-com:office:word" xmlns:w="http://schemas.openxmlformats.org/wordprocessingml/2006/main" xmlns:w14="http://schemas.microsoft.com/office/word/2010/wordml" xmlns:w15="http://schemas.microsoft.com/office/word/2012/wordml" xmlns:w16cex="http://schemas.microsoft.com/office/word/2018/wordml/cex" xmlns:w16cid="http://schemas.microsoft.com/office/word/2016/wordml/cid" xmlns:w16="http://schemas.microsoft.com/office/word/2018/wordml" xmlns:w16du="http://schemas.microsoft.com/office/word/2023/wordml/word16du" xmlns:w16sdtdh="http://schemas.microsoft.com/office/word/2020/wordml/sdtdatahash" xmlns:w16sdtfl="http://schemas.microsoft.com/office/word/2024/wordml/sdtformatlock" xmlns:w16se="http://schemas.microsoft.com/office/word/2015/wordml/symex" xmlns:wpg="http://schemas.microsoft.com/office/word/2010/wordprocessingGroup" xmlns:wpi="http://schemas.microsoft.com/office/word/2010/wordprocessingInk" xmlns:wne="http://schemas.microsoft.com/office/word/2006/wordml" xmlns:wps="http://schemas.microsoft.com/office/word/2010/wordprocessingShape" mc:Ignorable="w14 w15 w16se w16cid w16 w16cex w16sdtdh w16sdtfl w16du wp14">
   <w:p>
     <w:pPr>
-      <w:pStyle w:val="Kopfzeile"/>
+      <w:pStyle w:val="Header"/>
     </w:pPr>
   </w:p>
 </w:hdr>
 </file>
 
 <file path=word/header3.xml><?xml version="1.0" encoding="utf-8"?>
-<w:hdr xmlns:wpc="http://schemas.microsoft.com/office/word/2010/wordprocessingCanvas" xmlns:cx="http://schemas.microsoft.com/office/drawing/2014/chartex" xmlns:cx1="http://schemas.microsoft.com/office/drawing/2015/9/8/chartex" xmlns:cx2="http://schemas.microsoft.com/office/drawing/2015/10/21/chartex" xmlns:cx3="http://schemas.microsoft.com/office/drawing/2016/5/9/chartex" xmlns:cx4="http://schemas.microsoft.com/office/drawing/2016/5/10/chartex" xmlns:cx5="http://schemas.microsoft.com/office/drawing/2016/5/11/chartex" xmlns:cx6="http://schemas.microsoft.com/office/drawing/2016/5/12/chartex" xmlns:cx7="http://schemas.microsoft.com/office/drawing/2016/5/13/chartex" xmlns:cx8="http://schemas.microsoft.com/office/drawing/2016/5/14/chartex" xmlns:mc="http://schemas.openxmlformats.org/markup-compatibility/2006" xmlns:aink="http://schemas.microsoft.com/office/drawing/2016/ink" xmlns:am3d="http://schemas.microsoft.com/office/drawing/2017/model3d" xmlns:o="urn:schemas-microsoft-com:office:office" xmlns:oel="http://schemas.microsoft.com/office/2019/extlst" xmlns:r="http://schemas.openxmlformats.org/officeDocument/2006/relationships" xmlns:m="http://schemas.openxmlformats.org/officeDocument/2006/math" xmlns:v="urn:schemas-microsoft-com:vml" xmlns:wp14="http://schemas.microsoft.com/office/word/2010/wordprocessingDrawing" xmlns:wp="http://schemas.openxmlformats.org/drawingml/2006/wordprocessingDrawing" xmlns:w10="urn:schemas-microsoft-com:office:word" xmlns:w="http://schemas.openxmlformats.org/wordprocessingml/2006/main" xmlns:w14="http://schemas.microsoft.com/office/word/2010/wordml" xmlns:w15="http://schemas.microsoft.com/office/word/2012/wordml" xmlns:w16cex="http://schemas.microsoft.com/office/word/2018/wordml/cex" xmlns:w16cid="http://schemas.microsoft.com/office/word/2016/wordml/cid" xmlns:w16="http://schemas.microsoft.com/office/word/2018/wordml" xmlns:w16sdtdh="http://schemas.microsoft.com/office/word/2020/wordml/sdtdatahash" xmlns:w16se="http://schemas.microsoft.com/office/word/2015/wordml/symex" xmlns:wpg="http://schemas.microsoft.com/office/word/2010/wordprocessingGroup" xmlns:wpi="http://schemas.microsoft.com/office/word/2010/wordprocessingInk" xmlns:wne="http://schemas.microsoft.com/office/word/2006/wordml" xmlns:wps="http://schemas.microsoft.com/office/word/2010/wordprocessingShape" mc:Ignorable="w14 w15 w16se w16cid w16 w16cex w16sdtdh wp14">
+<w:hdr xmlns:wpc="http://schemas.microsoft.com/office/word/2010/wordprocessingCanvas" xmlns:cx="http://schemas.microsoft.com/office/drawing/2014/chartex" xmlns:cx1="http://schemas.microsoft.com/office/drawing/2015/9/8/chartex" xmlns:cx2="http://schemas.microsoft.com/office/drawing/2015/10/21/chartex" xmlns:cx3="http://schemas.microsoft.com/office/drawing/2016/5/9/chartex" xmlns:cx4="http://schemas.microsoft.com/office/drawing/2016/5/10/chartex" xmlns:cx5="http://schemas.microsoft.com/office/drawing/2016/5/11/chartex" xmlns:cx6="http://schemas.microsoft.com/office/drawing/2016/5/12/chartex" xmlns:cx7="http://schemas.microsoft.com/office/drawing/2016/5/13/chartex" xmlns:cx8="http://schemas.microsoft.com/office/drawing/2016/5/14/chartex" xmlns:mc="http://schemas.openxmlformats.org/markup-compatibility/2006" xmlns:aink="http://schemas.microsoft.com/office/drawing/2016/ink" xmlns:am3d="http://schemas.microsoft.com/office/drawing/2017/model3d" xmlns:o="urn:schemas-microsoft-com:office:office" xmlns:oel="http://schemas.microsoft.com/office/2019/extlst" xmlns:r="http://schemas.openxmlformats.org/officeDocument/2006/relationships" xmlns:m="http://schemas.openxmlformats.org/officeDocument/2006/math" xmlns:v="urn:schemas-microsoft-com:vml" xmlns:wp14="http://schemas.microsoft.com/office/word/2010/wordprocessingDrawing" xmlns:wp="http://schemas.openxmlformats.org/drawingml/2006/wordprocessingDrawing" xmlns:w10="urn:schemas-microsoft-com:office:word" xmlns:w="http://schemas.openxmlformats.org/wordprocessingml/2006/main" xmlns:w14="http://schemas.microsoft.com/office/word/2010/wordml" xmlns:w15="http://schemas.microsoft.com/office/word/2012/wordml" xmlns:w16cex="http://schemas.microsoft.com/office/word/2018/wordml/cex" xmlns:w16cid="http://schemas.microsoft.com/office/word/2016/wordml/cid" xmlns:w16="http://schemas.microsoft.com/office/word/2018/wordml" xmlns:w16du="http://schemas.microsoft.com/office/word/2023/wordml/word16du" xmlns:w16sdtdh="http://schemas.microsoft.com/office/word/2020/wordml/sdtdatahash" xmlns:w16sdtfl="http://schemas.microsoft.com/office/word/2024/wordml/sdtformatlock" xmlns:w16se="http://schemas.microsoft.com/office/word/2015/wordml/symex" xmlns:wpg="http://schemas.microsoft.com/office/word/2010/wordprocessingGroup" xmlns:wpi="http://schemas.microsoft.com/office/word/2010/wordprocessingInk" xmlns:wne="http://schemas.microsoft.com/office/word/2006/wordml" xmlns:wps="http://schemas.microsoft.com/office/word/2010/wordprocessingShape" mc:Ignorable="w14 w15 w16se w16cid w16 w16cex w16sdtdh w16sdtfl w16du wp14">
   <w:p>
     <w:pPr>
-      <w:pStyle w:val="Kopfzeile"/>
+      <w:pStyle w:val="Header"/>
     </w:pPr>
   </w:p>
 </w:hdr>
 </file>
 
 <file path=word/styles.xml><?xml version="1.0" encoding="utf-8"?>
-<w:styles xmlns:mc="http://schemas.openxmlformats.org/markup-compatibility/2006" xmlns:r="http://schemas.openxmlformats.org/officeDocument/2006/relationships" xmlns:w="http://schemas.openxmlformats.org/wordprocessingml/2006/main" xmlns:w14="http://schemas.microsoft.com/office/word/2010/wordml" xmlns:w15="http://schemas.microsoft.com/office/word/2012/wordml" xmlns:w16cex="http://schemas.microsoft.com/office/word/2018/wordml/cex" xmlns:w16cid="http://schemas.microsoft.com/office/word/2016/wordml/cid" xmlns:w16="http://schemas.microsoft.com/office/word/2018/wordml" xmlns:w16sdtdh="http://schemas.microsoft.com/office/word/2020/wordml/sdtdatahash" xmlns:w16se="http://schemas.microsoft.com/office/word/2015/wordml/symex" mc:Ignorable="w14 w15 w16se w16cid w16 w16cex w16sdtdh">
+<w:styles xmlns:mc="http://schemas.openxmlformats.org/markup-compatibility/2006" xmlns:r="http://schemas.openxmlformats.org/officeDocument/2006/relationships" xmlns:w="http://schemas.openxmlformats.org/wordprocessingml/2006/main" xmlns:w14="http://schemas.microsoft.com/office/word/2010/wordml" xmlns:w15="http://schemas.microsoft.com/office/word/2012/wordml" xmlns:w16cex="http://schemas.microsoft.com/office/word/2018/wordml/cex" xmlns:w16cid="http://schemas.microsoft.com/office/word/2016/wordml/cid" xmlns:w16="http://schemas.microsoft.com/office/word/2018/wordml" xmlns:w16du="http://schemas.microsoft.com/office/word/2023/wordml/word16du" xmlns:w16sdtdh="http://schemas.microsoft.com/office/word/2020/wordml/sdtdatahash" xmlns:w16sdtfl="http://schemas.microsoft.com/office/word/2024/wordml/sdtformatlock" xmlns:w16se="http://schemas.microsoft.com/office/word/2015/wordml/symex" mc:Ignorable="w14 w15 w16se w16cid w16 w16cex w16sdtdh w16sdtfl w16du">
   <w:docDefaults>
     <w:rPrDefault>
       <w:rPr>
@@ -6010,7 +5951,7 @@
     <w:lsdException w:name="Unresolved Mention" w:semiHidden="1" w:unhideWhenUsed="1"/>
     <w:lsdException w:name="Smart Link" w:semiHidden="1" w:unhideWhenUsed="1"/>
   </w:latentStyles>
-  <w:style w:type="paragraph" w:default="1" w:styleId="Standard">
+  <w:style w:type="paragraph" w:default="1" w:styleId="Normal">
     <w:name w:val="Normal"/>
     <w:qFormat/>
     <w:rsid w:val="00BD34E5"/>
@@ -6024,11 +5965,11 @@
       <w:lang w:val="en-US"/>
     </w:rPr>
   </w:style>
-  <w:style w:type="paragraph" w:styleId="berschrift1">
+  <w:style w:type="paragraph" w:styleId="Heading1">
     <w:name w:val="heading 1"/>
-    <w:basedOn w:val="Standard"/>
-    <w:next w:val="Standard"/>
-    <w:link w:val="berschrift1Zchn"/>
+    <w:basedOn w:val="Normal"/>
+    <w:next w:val="Normal"/>
+    <w:link w:val="Heading1Char"/>
     <w:uiPriority w:val="9"/>
     <w:qFormat/>
     <w:rsid w:val="00E1630C"/>
@@ -6046,11 +5987,11 @@
       <w:szCs w:val="32"/>
     </w:rPr>
   </w:style>
-  <w:style w:type="paragraph" w:styleId="berschrift2">
+  <w:style w:type="paragraph" w:styleId="Heading2">
     <w:name w:val="heading 2"/>
-    <w:basedOn w:val="Standard"/>
-    <w:next w:val="Standard"/>
-    <w:link w:val="berschrift2Zchn"/>
+    <w:basedOn w:val="Normal"/>
+    <w:next w:val="Normal"/>
+    <w:link w:val="Heading2Char"/>
     <w:uiPriority w:val="9"/>
     <w:unhideWhenUsed/>
     <w:qFormat/>
@@ -6069,11 +6010,11 @@
       <w:szCs w:val="26"/>
     </w:rPr>
   </w:style>
-  <w:style w:type="paragraph" w:styleId="berschrift3">
+  <w:style w:type="paragraph" w:styleId="Heading3">
     <w:name w:val="heading 3"/>
-    <w:basedOn w:val="Standard"/>
-    <w:next w:val="Standard"/>
-    <w:link w:val="berschrift3Zchn"/>
+    <w:basedOn w:val="Normal"/>
+    <w:next w:val="Normal"/>
+    <w:link w:val="Heading3Char"/>
     <w:uiPriority w:val="9"/>
     <w:unhideWhenUsed/>
     <w:qFormat/>
@@ -6091,12 +6032,13 @@
       <w:sz w:val="22"/>
     </w:rPr>
   </w:style>
-  <w:style w:type="character" w:default="1" w:styleId="Absatz-Standardschriftart">
+  <w:style w:type="character" w:default="1" w:styleId="DefaultParagraphFont">
     <w:name w:val="Default Paragraph Font"/>
     <w:uiPriority w:val="1"/>
+    <w:semiHidden/>
     <w:unhideWhenUsed/>
   </w:style>
-  <w:style w:type="table" w:default="1" w:styleId="NormaleTabelle">
+  <w:style w:type="table" w:default="1" w:styleId="TableNormal">
     <w:name w:val="Normal Table"/>
     <w:uiPriority w:val="99"/>
     <w:semiHidden/>
@@ -6111,16 +6053,16 @@
       </w:tblCellMar>
     </w:tblPr>
   </w:style>
-  <w:style w:type="numbering" w:default="1" w:styleId="KeineListe">
+  <w:style w:type="numbering" w:default="1" w:styleId="NoList">
     <w:name w:val="No List"/>
     <w:uiPriority w:val="99"/>
     <w:semiHidden/>
     <w:unhideWhenUsed/>
   </w:style>
-  <w:style w:type="table" w:styleId="Tabellenraster">
+  <w:style w:type="table" w:styleId="TableGrid">
     <w:name w:val="Table Grid"/>
     <w:aliases w:val="DK"/>
-    <w:basedOn w:val="NormaleTabelle"/>
+    <w:basedOn w:val="TableNormal"/>
     <w:uiPriority w:val="39"/>
     <w:rsid w:val="0067390E"/>
     <w:rPr>
@@ -6149,10 +6091,10 @@
       </w:tcPr>
     </w:tblStylePr>
   </w:style>
-  <w:style w:type="character" w:customStyle="1" w:styleId="berschrift1Zchn">
-    <w:name w:val="Überschrift 1 Zchn"/>
-    <w:basedOn w:val="Absatz-Standardschriftart"/>
-    <w:link w:val="berschrift1"/>
+  <w:style w:type="character" w:customStyle="1" w:styleId="Heading1Char">
+    <w:name w:val="Heading 1 Char"/>
+    <w:basedOn w:val="DefaultParagraphFont"/>
+    <w:link w:val="Heading1"/>
     <w:uiPriority w:val="9"/>
     <w:rsid w:val="00E1630C"/>
     <w:rPr>
@@ -6163,10 +6105,10 @@
       <w:szCs w:val="32"/>
     </w:rPr>
   </w:style>
-  <w:style w:type="character" w:customStyle="1" w:styleId="berschrift2Zchn">
-    <w:name w:val="Überschrift 2 Zchn"/>
-    <w:basedOn w:val="Absatz-Standardschriftart"/>
-    <w:link w:val="berschrift2"/>
+  <w:style w:type="character" w:customStyle="1" w:styleId="Heading2Char">
+    <w:name w:val="Heading 2 Char"/>
+    <w:basedOn w:val="DefaultParagraphFont"/>
+    <w:link w:val="Heading2"/>
     <w:uiPriority w:val="9"/>
     <w:rsid w:val="003155A4"/>
     <w:rPr>
@@ -6176,11 +6118,11 @@
       <w:szCs w:val="26"/>
     </w:rPr>
   </w:style>
-  <w:style w:type="paragraph" w:styleId="Titel">
+  <w:style w:type="paragraph" w:styleId="Title">
     <w:name w:val="Title"/>
-    <w:basedOn w:val="Standard"/>
-    <w:next w:val="Standard"/>
-    <w:link w:val="TitelZchn"/>
+    <w:basedOn w:val="Normal"/>
+    <w:next w:val="Normal"/>
+    <w:link w:val="TitleChar"/>
     <w:uiPriority w:val="10"/>
     <w:qFormat/>
     <w:rsid w:val="00A86119"/>
@@ -6197,10 +6139,10 @@
       <w:szCs w:val="56"/>
     </w:rPr>
   </w:style>
-  <w:style w:type="character" w:customStyle="1" w:styleId="TitelZchn">
-    <w:name w:val="Titel Zchn"/>
-    <w:basedOn w:val="Absatz-Standardschriftart"/>
-    <w:link w:val="Titel"/>
+  <w:style w:type="character" w:customStyle="1" w:styleId="TitleChar">
+    <w:name w:val="Title Char"/>
+    <w:basedOn w:val="DefaultParagraphFont"/>
+    <w:link w:val="Title"/>
     <w:uiPriority w:val="10"/>
     <w:rsid w:val="00A86119"/>
     <w:rPr>
@@ -6212,9 +6154,9 @@
       <w:szCs w:val="56"/>
     </w:rPr>
   </w:style>
-  <w:style w:type="table" w:styleId="TabellemithellemGitternetz">
+  <w:style w:type="table" w:styleId="TableGridLight">
     <w:name w:val="Grid Table Light"/>
-    <w:basedOn w:val="NormaleTabelle"/>
+    <w:basedOn w:val="TableNormal"/>
     <w:uiPriority w:val="40"/>
     <w:rsid w:val="00A86119"/>
     <w:tblPr>
@@ -6228,9 +6170,9 @@
       </w:tblBorders>
     </w:tblPr>
   </w:style>
-  <w:style w:type="table" w:styleId="EinfacheTabelle4">
+  <w:style w:type="table" w:styleId="PlainTable4">
     <w:name w:val="Plain Table 4"/>
-    <w:basedOn w:val="NormaleTabelle"/>
+    <w:basedOn w:val="TableNormal"/>
     <w:uiPriority w:val="44"/>
     <w:rsid w:val="00A86119"/>
     <w:tblPr>
@@ -6274,9 +6216,9 @@
       </w:tcPr>
     </w:tblStylePr>
   </w:style>
-  <w:style w:type="paragraph" w:styleId="KeinLeerraum">
+  <w:style w:type="paragraph" w:styleId="NoSpacing">
     <w:name w:val="No Spacing"/>
-    <w:next w:val="Standard"/>
+    <w:next w:val="Normal"/>
     <w:uiPriority w:val="1"/>
     <w:qFormat/>
     <w:rsid w:val="00A86119"/>
@@ -6286,7 +6228,7 @@
   </w:style>
   <w:style w:type="character" w:customStyle="1" w:styleId="hochgestellt">
     <w:name w:val="hochgestellt"/>
-    <w:basedOn w:val="Absatz-Standardschriftart"/>
+    <w:basedOn w:val="DefaultParagraphFont"/>
     <w:uiPriority w:val="1"/>
     <w:qFormat/>
     <w:rsid w:val="006841D6"/>
@@ -6296,7 +6238,7 @@
   </w:style>
   <w:style w:type="character" w:customStyle="1" w:styleId="tiefgestellt">
     <w:name w:val="tiefgestellt"/>
-    <w:basedOn w:val="Absatz-Standardschriftart"/>
+    <w:basedOn w:val="DefaultParagraphFont"/>
     <w:uiPriority w:val="1"/>
     <w:qFormat/>
     <w:rsid w:val="00A86119"/>
@@ -6304,10 +6246,10 @@
       <w:vertAlign w:val="subscript"/>
     </w:rPr>
   </w:style>
-  <w:style w:type="character" w:customStyle="1" w:styleId="berschrift3Zchn">
-    <w:name w:val="Überschrift 3 Zchn"/>
-    <w:basedOn w:val="Absatz-Standardschriftart"/>
-    <w:link w:val="berschrift3"/>
+  <w:style w:type="character" w:customStyle="1" w:styleId="Heading3Char">
+    <w:name w:val="Heading 3 Char"/>
+    <w:basedOn w:val="DefaultParagraphFont"/>
+    <w:link w:val="Heading3"/>
     <w:uiPriority w:val="9"/>
     <w:rsid w:val="00AD1E84"/>
     <w:rPr>
@@ -6319,7 +6261,7 @@
   </w:style>
   <w:style w:type="paragraph" w:customStyle="1" w:styleId="fliesstext">
     <w:name w:val="fliesstext"/>
-    <w:basedOn w:val="Standard"/>
+    <w:basedOn w:val="Normal"/>
     <w:qFormat/>
     <w:rsid w:val="002D5F04"/>
     <w:pPr>
@@ -6367,10 +6309,10 @@
       <w:jc w:val="left"/>
     </w:pPr>
   </w:style>
-  <w:style w:type="paragraph" w:styleId="Beschriftung">
+  <w:style w:type="paragraph" w:styleId="Caption">
     <w:name w:val="caption"/>
-    <w:basedOn w:val="Standard"/>
-    <w:next w:val="Standard"/>
+    <w:basedOn w:val="Normal"/>
+    <w:next w:val="Normal"/>
     <w:uiPriority w:val="35"/>
     <w:unhideWhenUsed/>
     <w:qFormat/>
@@ -6388,7 +6330,7 @@
   </w:style>
   <w:style w:type="character" w:styleId="Hyperlink">
     <w:name w:val="Hyperlink"/>
-    <w:basedOn w:val="Absatz-Standardschriftart"/>
+    <w:basedOn w:val="DefaultParagraphFont"/>
     <w:uiPriority w:val="99"/>
     <w:unhideWhenUsed/>
     <w:rsid w:val="00EA79B1"/>
@@ -6397,9 +6339,9 @@
       <w:u w:val="single"/>
     </w:rPr>
   </w:style>
-  <w:style w:type="character" w:styleId="NichtaufgelsteErwhnung">
+  <w:style w:type="character" w:styleId="UnresolvedMention">
     <w:name w:val="Unresolved Mention"/>
-    <w:basedOn w:val="Absatz-Standardschriftart"/>
+    <w:basedOn w:val="DefaultParagraphFont"/>
     <w:uiPriority w:val="99"/>
     <w:semiHidden/>
     <w:unhideWhenUsed/>
@@ -6409,10 +6351,10 @@
       <w:shd w:val="clear" w:color="auto" w:fill="E1DFDD"/>
     </w:rPr>
   </w:style>
-  <w:style w:type="paragraph" w:styleId="Kopfzeile">
+  <w:style w:type="paragraph" w:styleId="Header">
     <w:name w:val="header"/>
-    <w:basedOn w:val="Standard"/>
-    <w:link w:val="KopfzeileZchn"/>
+    <w:basedOn w:val="Normal"/>
+    <w:link w:val="HeaderChar"/>
     <w:uiPriority w:val="99"/>
     <w:unhideWhenUsed/>
     <w:rsid w:val="00132DB6"/>
@@ -6424,10 +6366,10 @@
       <w:spacing w:line="240" w:lineRule="auto"/>
     </w:pPr>
   </w:style>
-  <w:style w:type="character" w:customStyle="1" w:styleId="KopfzeileZchn">
-    <w:name w:val="Kopfzeile Zchn"/>
-    <w:basedOn w:val="Absatz-Standardschriftart"/>
-    <w:link w:val="Kopfzeile"/>
+  <w:style w:type="character" w:customStyle="1" w:styleId="HeaderChar">
+    <w:name w:val="Header Char"/>
+    <w:basedOn w:val="DefaultParagraphFont"/>
+    <w:link w:val="Header"/>
     <w:uiPriority w:val="99"/>
     <w:rsid w:val="00132DB6"/>
     <w:rPr>
@@ -6435,10 +6377,10 @@
       <w:sz w:val="20"/>
     </w:rPr>
   </w:style>
-  <w:style w:type="paragraph" w:styleId="Fuzeile">
+  <w:style w:type="paragraph" w:styleId="Footer">
     <w:name w:val="footer"/>
-    <w:basedOn w:val="Standard"/>
-    <w:link w:val="FuzeileZchn"/>
+    <w:basedOn w:val="Normal"/>
+    <w:link w:val="FooterChar"/>
     <w:uiPriority w:val="99"/>
     <w:unhideWhenUsed/>
     <w:rsid w:val="00132DB6"/>
@@ -6450,10 +6392,10 @@
       <w:spacing w:line="240" w:lineRule="auto"/>
     </w:pPr>
   </w:style>
-  <w:style w:type="character" w:customStyle="1" w:styleId="FuzeileZchn">
-    <w:name w:val="Fußzeile Zchn"/>
-    <w:basedOn w:val="Absatz-Standardschriftart"/>
-    <w:link w:val="Fuzeile"/>
+  <w:style w:type="character" w:customStyle="1" w:styleId="FooterChar">
+    <w:name w:val="Footer Char"/>
+    <w:basedOn w:val="DefaultParagraphFont"/>
+    <w:link w:val="Footer"/>
     <w:uiPriority w:val="99"/>
     <w:rsid w:val="00132DB6"/>
     <w:rPr>
@@ -6463,7 +6405,7 @@
   </w:style>
   <w:style w:type="paragraph" w:customStyle="1" w:styleId="BodyText1">
     <w:name w:val="Body Text1"/>
-    <w:basedOn w:val="Standard"/>
+    <w:basedOn w:val="Normal"/>
     <w:qFormat/>
     <w:rsid w:val="00CD575A"/>
     <w:pPr>

</xml_diff>